<commit_message>
Python Library Website For Beginners
</commit_message>
<xml_diff>
--- a/Prompt_Engineering.docx
+++ b/Prompt_Engineering.docx
@@ -6,11 +6,17 @@
       <w:pPr>
         <w:jc w:val="both"/>
         <w:rPr>
+          <w:b/>
+          <w:bCs/>
+          <w:u w:val="single"/>
           <w:lang w:val="en-GB"/>
         </w:rPr>
       </w:pPr>
       <w:r>
         <w:rPr>
+          <w:b/>
+          <w:bCs/>
+          <w:u w:val="single"/>
           <w:lang w:val="en-GB"/>
         </w:rPr>
         <w:t>Prompt Used:</w:t>
@@ -127,11 +133,76 @@
       <w:pPr>
         <w:jc w:val="both"/>
         <w:rPr>
+          <w:b/>
+          <w:bCs/>
+          <w:u w:val="single"/>
           <w:lang w:val="en-GB"/>
         </w:rPr>
       </w:pPr>
       <w:r>
         <w:rPr>
+          <w:b/>
+          <w:bCs/>
+          <w:u w:val="single"/>
+          <w:lang w:val="en-GB"/>
+        </w:rPr>
+        <w:t>Chat Bot:</w:t>
+      </w:r>
+    </w:p>
+    <w:p>
+      <w:pPr>
+        <w:pStyle w:val="ListParagraph"/>
+        <w:numPr>
+          <w:ilvl w:val="0"/>
+          <w:numId w:val="4"/>
+        </w:numPr>
+        <w:jc w:val="both"/>
+        <w:rPr>
+          <w:lang w:val="en-GB"/>
+        </w:rPr>
+      </w:pPr>
+      <w:r>
+        <w:rPr>
+          <w:lang w:val="en-GB"/>
+        </w:rPr>
+        <w:t>https://copilot.microsoft.com/</w:t>
+      </w:r>
+    </w:p>
+    <w:p>
+      <w:pPr>
+        <w:ind w:left="360"/>
+        <w:jc w:val="both"/>
+        <w:rPr>
+          <w:u w:val="single"/>
+          <w:lang w:val="en-GB"/>
+        </w:rPr>
+      </w:pPr>
+    </w:p>
+    <w:p>
+      <w:pPr>
+        <w:ind w:left="360"/>
+        <w:jc w:val="both"/>
+        <w:rPr>
+          <w:u w:val="single"/>
+          <w:lang w:val="en-GB"/>
+        </w:rPr>
+      </w:pPr>
+    </w:p>
+    <w:p>
+      <w:pPr>
+        <w:jc w:val="both"/>
+        <w:rPr>
+          <w:b/>
+          <w:bCs/>
+          <w:u w:val="single"/>
+          <w:lang w:val="en-GB"/>
+        </w:rPr>
+      </w:pPr>
+      <w:r>
+        <w:rPr>
+          <w:b/>
+          <w:bCs/>
+          <w:u w:val="single"/>
           <w:lang w:val="en-GB"/>
         </w:rPr>
         <w:t>Final Prompt:</w:t>
@@ -153,7 +224,22 @@
         <w:rPr>
           <w:lang w:val="en-GB"/>
         </w:rPr>
-        <w:t>Think yourself as a senior web developer with an experience of 6-8 years and develop a website which contain detailed notes of all python libraries like NumPy, seaborn, pandas, matplotlib. And should contain minimum 3–5-line explanation about all the topics and properties and methods also add some mini projects, also add the graphical representation of the graphs or plots and with some real time examples. And also refer to multiple learning website and documentation and some publications and free courses present in the web and the website should be user interactive and attractive with decent colours. And create the HTML and CSS files separately for the deploying of the files. And give the excellent and effective output</w:t>
+        <w:t>Think yourself as a senior web developer with an experience of 6-8 years and develop a website which contain detailed notes of all python libraries like NumPy, seaborn, pandas, matplotlib. And should contain minimum 3–5-line explanation about all the topics and properties and methods also add some mini projects, also add the graphical representation of the graphs or plots and with some real time examples.</w:t>
+      </w:r>
+      <w:r>
+        <w:rPr>
+          <w:lang w:val="en-GB"/>
+        </w:rPr>
+        <w:t xml:space="preserve"> And  </w:t>
+      </w:r>
+      <w:r>
+        <w:t>in seaborn and matplotlib you should graphical for each plot</w:t>
+      </w:r>
+      <w:r>
+        <w:rPr>
+          <w:lang w:val="en-GB"/>
+        </w:rPr>
+        <w:t xml:space="preserve"> And also refer to multiple learning website and documentation and some publications and free courses present in the web and the website should be user interactive and attractive with decent colours. And create the HTML and CSS files separately for the deploying of the files. And give the excellent and effective output</w:t>
       </w:r>
       <w:r>
         <w:rPr>
@@ -166,27 +252,17 @@
       <w:pPr>
         <w:jc w:val="both"/>
         <w:rPr>
-          <w:lang w:val="en-GB"/>
-        </w:rPr>
-      </w:pPr>
-    </w:p>
-    <w:p>
-      <w:pPr>
-        <w:jc w:val="both"/>
-        <w:rPr>
-          <w:lang w:val="en-GB"/>
-        </w:rPr>
-      </w:pPr>
-    </w:p>
-    <w:p>
-      <w:pPr>
-        <w:jc w:val="both"/>
-        <w:rPr>
+          <w:b/>
+          <w:bCs/>
+          <w:u w:val="single"/>
           <w:lang w:val="en-GB"/>
         </w:rPr>
       </w:pPr>
       <w:r>
         <w:rPr>
+          <w:b/>
+          <w:bCs/>
+          <w:u w:val="single"/>
           <w:lang w:val="en-GB"/>
         </w:rPr>
         <w:t>Chat Bot:</w:t>
@@ -1055,6 +1131,7 @@
   <w:style w:type="paragraph" w:default="1" w:styleId="Normal">
     <w:name w:val="Normal"/>
     <w:qFormat/>
+    <w:rsid w:val="00C83918"/>
   </w:style>
   <w:style w:type="paragraph" w:styleId="Heading1">
     <w:name w:val="heading 1"/>
@@ -1258,7 +1335,6 @@
   <w:style w:type="character" w:default="1" w:styleId="DefaultParagraphFont">
     <w:name w:val="Default Paragraph Font"/>
     <w:uiPriority w:val="1"/>
-    <w:semiHidden/>
     <w:unhideWhenUsed/>
   </w:style>
   <w:style w:type="table" w:default="1" w:styleId="TableNormal">

</xml_diff>